<commit_message>
Add my own Scene view walkthrough video and point the document and README at it
</commit_message>
<xml_diff>
--- a/Submission/Lab03_BSSE23040.docx
+++ b/Submission/Lab03_BSSE23040.docx
@@ -59,7 +59,7 @@
         </w:rPr>
         <w:t xml:space="preserve">GitHub repository: </w:t>
       </w:r>
-      <w:hyperlink w:history="1" r:id="rIdaksmwt_zravztg7irg_df">
+      <w:hyperlink w:history="1" r:id="rIdytkvdrfjsi9v3rnjuz0rt">
         <w:r>
           <w:rPr>
             <w:rFonts w:ascii="Calibri" w:cs="Calibri" w:eastAsia="Calibri" w:hAnsi="Calibri"/>
@@ -97,7 +97,7 @@
         <w:rPr>
           <w:rFonts w:ascii="Calibri" w:cs="Calibri" w:eastAsia="Calibri" w:hAnsi="Calibri"/>
         </w:rPr>
-        <w:t xml:space="preserve">For this lab I made a simple grey-box level in Unity from the provided POLYGON Prototype Pack by Synty. It has no scenery and no colour: only grey boxes, with one marked default route from the spawn to the goal. This document has my reference images, screenshots of the level, an explanation of the level and its obstacles, and the reasons for my design. The screen recording is a separate file, LevelWalkthrough.mp4, and it follows the default route.</w:t>
+        <w:t xml:space="preserve">For this lab I made a simple grey-box level in Unity from the provided POLYGON Prototype Pack by Synty. It has no scenery and no colour: only grey boxes, with one marked default route from the spawn to the goal. This document has my reference images, screenshots of the level, an explanation of the level and its obstacles, and the reasons for my design. The screen recording is a separate file, Game_Dev_Lab_03.mp4: I recorded it myself in Unity, moving around the level in the Scene view.</w:t>
       </w:r>
     </w:p>
     <w:p>
@@ -1323,7 +1323,7 @@
         <w:rPr>
           <w:rFonts w:ascii="Calibri" w:cs="Calibri" w:eastAsia="Calibri" w:hAnsi="Calibri"/>
         </w:rPr>
-        <w:t xml:space="preserve">A small editor script (Assets/Editor/SimpleLevels.cs) places each piece by its measured size, so the walls and floors line up on a 5 m grid. The level is in Assets/Scenes/Lab03 in the repository. I used Unity's Scene view to look around, and the walkthrough video is a camera flown along the default route in the Scene view.</w:t>
+        <w:t xml:space="preserve">A small editor script (Assets/Editor/SimpleLevels.cs) places each piece by its measured size, so the walls and floors line up on a 5 m grid. The level is in Assets/Scenes/Lab03 in the repository. I recorded the walkthrough video myself, moving the Scene view camera around the level.</w:t>
       </w:r>
     </w:p>
     <w:tbl>
@@ -1731,7 +1731,7 @@
         <w:rPr>
           <w:rFonts w:ascii="Calibri" w:cs="Calibri" w:eastAsia="Calibri" w:hAnsi="Calibri"/>
         </w:rPr>
-        <w:t xml:space="preserve">The Scene view walkthrough is in LevelWalkthrough.mp4, and everything (scene, scripts, screenshots, references) is in the GitHub repository linked at the top.</w:t>
+        <w:t xml:space="preserve">The Scene view walkthrough is in Game_Dev_Lab_03.mp4, and everything (scene, scripts, screenshots, references) is in the GitHub repository linked at the top.</w:t>
       </w:r>
     </w:p>
     <w:sectPr>

</xml_diff>